<commit_message>
Document streaming and conversation language behavior
</commit_message>
<xml_diff>
--- a/docs/requirements/Kairos_Requisiti_Funzionali.docx
+++ b/docs/requirements/Kairos_Requisiti_Funzionali.docx
@@ -83,7 +83,7 @@
         <w:jc w:val="center"/>
       </w:pPr>
       <w:r>
-        <w:t>Versione 0.1</w:t>
+        <w:t>Versione 0.2</w:t>
       </w:r>
     </w:p>
     <w:p>
@@ -91,7 +91,7 @@
         <w:jc w:val="center"/>
       </w:pPr>
       <w:r>
-        <w:t>24 ottobre 2026</w:t>
+        <w:t>25 ottobre 2026</w:t>
       </w:r>
     </w:p>
     <w:p>
@@ -128,7 +128,7 @@
         <w:rPr>
           <w:b w:val="0"/>
         </w:rPr>
-        <w:t>La proposta funzionale è raccogliere la descrizione di un impegno, chiarire i dati mancanti e organizzarla in un evento con le attività da svolgere prima o dopo e i promemoria scelti dall’utente. L’interazione prevista comprende voce o testo e componenti dentro l’app; Android è la prima piattaforma e italiano e inglese sono richiesti fin dall’inizio.</w:t>
+        <w:t>La proposta funzionale è raccogliere la descrizione di un impegno, chiarire i dati mancanti e organizzarla in un evento con le attività da svolgere prima o dopo e i promemoria scelti dall’utente. L’interazione prevista comprende voce o testo e componenti dentro l’app; Android è la prima piattaforma e italiano e inglese sono richiesti fin dall’inizio. Nel backend e nella CLI, i testi statici seguono la lingua dell’interfaccia, mentre chiarimenti e testo LLM seguono la lingua della conversazione. La CLI può mostrare il testo LLM in streaming e comunicare le fasi osservabili del workflow.</w:t>
       </w:r>
     </w:p>
     <w:p>
@@ -310,7 +310,7 @@
         <w:rPr>
           <w:b w:val="0"/>
         </w:rPr>
-        <w:t>4. L’utente può correggere la bozza e configurare N promemoria; il comportamento in caso di nessun promemoria resta da definire.</w:t>
+        <w:t>4. L’utente può correggere la bozza e configurare N promemoria; il comportamento in caso di nessun promemoria resta da definire. Nel backend/CLI, la lingua della conversazione è scelta dal contesto e può cambiare su richiesta esplicita o chiaramente espressa. L’implementazione è verificata con risposte LLM simulate: non garantisce il riconoscimento della lingua da parte di un modello reale.</w:t>
       </w:r>
     </w:p>
     <w:p>
@@ -323,30 +323,6 @@
           <w:b w:val="0"/>
         </w:rPr>
         <w:t>5. La revisione della bozza da parte dell’utente è un comportamento proposto da validare; le correzioni conversazionali della bozza sono già supportate nel workflow backend.</w:t>
-      </w:r>
-    </w:p>
-    <w:p>
-      <w:pPr>
-        <w:spacing w:after="40"/>
-        <w:ind w:left="346" w:hanging="346"/>
-      </w:pPr>
-      <w:r>
-        <w:rPr>
-          <w:b w:val="0"/>
-        </w:rPr>
-        <w:t>6. Come obiettivo della POC, Kairos crea l’evento con le attività e i promemoria configurati. La destinazione dell’evento (calendario interno o esterno) e il meccanismo con cui recapitare i promemoria restano da decidere; creazione persistente e notifiche non risultano implementate.</w:t>
-      </w:r>
-    </w:p>
-    <w:p>
-      <w:pPr>
-        <w:spacing w:after="40"/>
-        <w:ind w:left="346" w:hanging="346"/>
-      </w:pPr>
-      <w:r>
-        <w:rPr>
-          <w:b w:val="0"/>
-        </w:rPr>
-        <w:t>7. In una futura esperienza completa, l’utente può ritrovare il contesto essenziale che ha scelto di condividere. Persistenza e gestione del profilo non risultano implementate.</w:t>
       </w:r>
     </w:p>
     <w:p>
@@ -791,7 +767,7 @@
         <w:rPr>
           <w:b w:val="0"/>
         </w:rPr>
-        <w:t xml:space="preserve">  L’app supporta italiano e inglese fin dall’inizio. I flussi funzionali principali sono disponibili in entrambe le lingue.</w:t>
+        <w:t xml:space="preserve">  I testi statici dell’interfaccia e i flussi funzionali principali supportano italiano e inglese. La lingua dell’interfaccia può differire da quella della conversazione.</w:t>
       </w:r>
     </w:p>
     <w:p>
@@ -813,7 +789,7 @@
           <w:b w:val="0"/>
           <w:sz w:val="20"/>
         </w:rPr>
-        <w:t xml:space="preserve">  Richiesto; supporto effettivo nell’app non implementato. La relazione tra lingua UI e lingua della conversazione è aperta.</w:t>
+        <w:t xml:space="preserve">  Richiesto; catalogo statico completo e validato nel backend/CLI. L’app non è implementata.</w:t>
       </w:r>
     </w:p>
     <w:p>
@@ -998,6 +974,141 @@
     </w:p>
     <w:p>
       <w:pPr>
+        <w:keepNext/>
+        <w:spacing w:before="160" w:after="60"/>
+      </w:pPr>
+      <w:r>
+        <w:rPr>
+          <w:b w:val="0"/>
+        </w:rPr>
+      </w:r>
+      <w:r>
+        <w:rPr>
+          <w:b/>
+        </w:rPr>
+        <w:t>FR-15</w:t>
+      </w:r>
+      <w:r>
+        <w:rPr>
+          <w:b w:val="0"/>
+        </w:rPr>
+        <w:t xml:space="preserve">  Le stringhe statiche seguono la lingua dell’interfaccia. Per ogni turno, chiarimenti e testo LLM seguono una sola lingua conversazionale: la preferenza iniziale deriva dal contesto, messaggi brevi come “ok”, date e numeri mantengono la lingua precedente, mentre un cambio esplicito o chiaramente espresso aggiorna la lingua.</w:t>
+      </w:r>
+    </w:p>
+    <w:p>
+      <w:r>
+        <w:rPr>
+          <w:b w:val="0"/>
+          <w:sz w:val="20"/>
+        </w:rPr>
+      </w:r>
+      <w:r>
+        <w:rPr>
+          <w:b/>
+          <w:sz w:val="20"/>
+        </w:rPr>
+        <w:t>Stato</w:t>
+      </w:r>
+      <w:r>
+        <w:rPr>
+          <w:b w:val="0"/>
+          <w:sz w:val="20"/>
+        </w:rPr>
+        <w:t xml:space="preserve">  Decisione dell’utente del 25 ottobre 2026; implementato nel backend/CLI e verificato con provider simulato. La lingua effettivamente scelta da un modello reale non è stata verificata né è garantita.</w:t>
+      </w:r>
+    </w:p>
+    <w:p>
+      <w:pPr>
+        <w:keepNext/>
+        <w:spacing w:before="160" w:after="60"/>
+      </w:pPr>
+      <w:r>
+        <w:rPr>
+          <w:b w:val="0"/>
+        </w:rPr>
+      </w:r>
+      <w:r>
+        <w:rPr>
+          <w:b/>
+        </w:rPr>
+        <w:t>FR-16</w:t>
+      </w:r>
+      <w:r>
+        <w:rPr>
+          <w:b w:val="0"/>
+        </w:rPr>
+        <w:t xml:space="preserve">  Quando il provider produce testo in streaming, la CLI può mostrarlo progressivamente. La tool call non viene presentata come JSON o argomenti tecnici: dopo raccolta e validazione, l’interfaccia mostra la bozza validata. Non vengono mostrati argomenti JSON parziali né reasoning.</w:t>
+      </w:r>
+    </w:p>
+    <w:p>
+      <w:r>
+        <w:rPr>
+          <w:b w:val="0"/>
+          <w:sz w:val="20"/>
+        </w:rPr>
+      </w:r>
+      <w:r>
+        <w:rPr>
+          <w:b/>
+          <w:sz w:val="20"/>
+        </w:rPr>
+        <w:t>Stato</w:t>
+      </w:r>
+      <w:r>
+        <w:rPr>
+          <w:b w:val="0"/>
+          <w:sz w:val="20"/>
+        </w:rPr>
+        <w:t xml:space="preserve">  Decisione dell’utente del 25 ottobre 2026; streaming opzionale distinto dalle tool call, implementato nel backend/CLI e verificato con provider simulato.</w:t>
+      </w:r>
+    </w:p>
+    <w:p>
+      <w:pPr>
+        <w:keepNext/>
+        <w:spacing w:before="160" w:after="60"/>
+      </w:pPr>
+      <w:r>
+        <w:rPr>
+          <w:b w:val="0"/>
+        </w:rPr>
+      </w:r>
+      <w:r>
+        <w:rPr>
+          <w:b/>
+        </w:rPr>
+        <w:t>FR-17</w:t>
+      </w:r>
+      <w:r>
+        <w:rPr>
+          <w:b w:val="0"/>
+        </w:rPr>
+        <w:t xml:space="preserve">  Durante il turno, la CLI comunica progressi statici nella lingua dell’interfaccia, riferiti a fasi reali osservabili dal codice. Non simula attese né descrive pensieri del modello e non aggiunge chiamate LLM per generare aggiornamenti.</w:t>
+      </w:r>
+    </w:p>
+    <w:p>
+      <w:r>
+        <w:rPr>
+          <w:b w:val="0"/>
+          <w:sz w:val="20"/>
+        </w:rPr>
+      </w:r>
+      <w:r>
+        <w:rPr>
+          <w:b/>
+          <w:sz w:val="20"/>
+        </w:rPr>
+        <w:t>Stato</w:t>
+      </w:r>
+      <w:r>
+        <w:rPr>
+          <w:b w:val="0"/>
+          <w:sz w:val="20"/>
+        </w:rPr>
+        <w:t xml:space="preserve">  Decisione dell’utente del 25 ottobre 2026; implementato nel backend/CLI e verificato con provider simulato.</w:t>
+      </w:r>
+    </w:p>
+    <w:p>
+      <w:pPr>
         <w:pStyle w:val="Heading1"/>
       </w:pPr>
       <w:r>
@@ -1134,6 +1245,28 @@
           <w:b w:val="0"/>
         </w:rPr>
         <w:t xml:space="preserve"> non sono definiti indicatori, soglie o promesse di miglioramento. Nessuna funzione implica diagnosi o trattamento clinico.</w:t>
+      </w:r>
+    </w:p>
+    <w:p>
+      <w:pPr>
+        <w:pStyle w:val="ListBullet"/>
+      </w:pPr>
+      <w:r>
+        <w:rPr>
+          <w:b w:val="0"/>
+        </w:rPr>
+      </w:r>
+      <w:r>
+        <w:rPr>
+          <w:b/>
+        </w:rPr>
+        <w:t>Lingua per turno, streaming e progressi — decisione del 25 ottobre 2026:</w:t>
+      </w:r>
+      <w:r>
+        <w:rPr>
+          <w:b w:val="0"/>
+        </w:rPr>
+        <w:t xml:space="preserve"> i testi statici seguono la lingua UI; chiarimenti e testo LLM seguono la lingua conversazionale; i progressi statici CLI seguono la lingua UI. L’implementazione è stata verificata con provider simulato, non con un modello reale.</w:t>
       </w:r>
     </w:p>
     <w:p>
@@ -1539,6 +1672,71 @@
         <w:pStyle w:val="Heading2"/>
       </w:pPr>
       <w:r>
+        <w:t>Lingua streaming e progressi</w:t>
+      </w:r>
+    </w:p>
+    <w:p>
+      <w:r>
+        <w:rPr>
+          <w:b w:val="0"/>
+        </w:rPr>
+      </w:r>
+      <w:r>
+        <w:rPr>
+          <w:b/>
+        </w:rPr>
+        <w:t>Obiettivo</w:t>
+      </w:r>
+      <w:r>
+        <w:rPr>
+          <w:b w:val="0"/>
+        </w:rPr>
+        <w:t xml:space="preserve">  Nel backend e nella CLI: stringhe statiche IT/EN complete; lingua conversazionale per chiarimenti e testo LLM; streaming testuale opzionale; progressi CLI statici nella lingua UI e legati a fasi osservabili.</w:t>
+      </w:r>
+    </w:p>
+    <w:p>
+      <w:r>
+        <w:rPr>
+          <w:b w:val="0"/>
+        </w:rPr>
+      </w:r>
+      <w:r>
+        <w:rPr>
+          <w:b/>
+        </w:rPr>
+        <w:t>Disponibilità attuale</w:t>
+      </w:r>
+      <w:r>
+        <w:rPr>
+          <w:b w:val="0"/>
+        </w:rPr>
+        <w:t xml:space="preserve">  Implementato e verificato con provider simulato. Il comportamento con modello reale e la sua scelta effettiva della lingua restano da verificare.</w:t>
+      </w:r>
+    </w:p>
+    <w:p>
+      <w:r>
+        <w:rPr>
+          <w:b w:val="0"/>
+        </w:rPr>
+      </w:r>
+      <w:r>
+        <w:rPr>
+          <w:b/>
+        </w:rPr>
+        <w:t>Evoluzione</w:t>
+      </w:r>
+      <w:r>
+        <w:rPr>
+          <w:b w:val="0"/>
+        </w:rPr>
+        <w:t xml:space="preserve">  API, app mobile, persistenza e notifiche sono fuori dallo scope di questa decisione.</w:t>
+      </w:r>
+    </w:p>
+    <w:p>
+      <w:pPr>
+        <w:pStyle w:val="Heading2"/>
+      </w:pPr>
+      <w:r>
         <w:t>Primo passo inviti e ripartenza</w:t>
       </w:r>
     </w:p>
@@ -1661,7 +1859,7 @@
         <w:rPr>
           <w:b w:val="0"/>
         </w:rPr>
-        <w:t>4. Italiano e inglese si applicano sia all’interfaccia sia alla conversazione? Come si sceglie la lingua quando differiscono?</w:t>
+        <w:t>4. Quali informazioni essenziali possono entrare nel profilo e quali controlli avrà l’utente su di esse?</w:t>
       </w:r>
     </w:p>
     <w:p>
@@ -1673,7 +1871,7 @@
         <w:rPr>
           <w:b w:val="0"/>
         </w:rPr>
-        <w:t>5. Quali informazioni essenziali possono entrare nel profilo e quali controlli avrà l’utente su di esse?</w:t>
+        <w:t>5. L’onboarding guidato entra nella POC? Quali scelte aiutano senza aggiungere attrito?</w:t>
       </w:r>
     </w:p>
     <w:p>
@@ -1685,7 +1883,7 @@
         <w:rPr>
           <w:b w:val="0"/>
         </w:rPr>
-        <w:t>6. L’onboarding guidato entra nella POC? Quali scelte aiutano senza aggiungere attrito?</w:t>
+        <w:t>6. I guardrail restano futuri o vengono anticipati alla prima versione? Quali regole osservabili ne definiscono il perimetro?</w:t>
       </w:r>
     </w:p>
     <w:p>
@@ -1697,19 +1895,7 @@
         <w:rPr>
           <w:b w:val="0"/>
         </w:rPr>
-        <w:t>7. I guardrail restano futuri o vengono anticipati alla prima versione? Quali regole osservabili ne definiscono il perimetro?</w:t>
-      </w:r>
-    </w:p>
-    <w:p>
-      <w:pPr>
-        <w:spacing w:after="40"/>
-        <w:ind w:left="346" w:hanging="346"/>
-      </w:pPr>
-      <w:r>
-        <w:rPr>
-          <w:b w:val="0"/>
-        </w:rPr>
-        <w:t>8. Quali scenari e utenti serviranno per valutare se il flusso è comprensibile e utile?</w:t>
+        <w:t>7. Quali scenari e utenti serviranno per valutare se il flusso è comprensibile e utile?</w:t>
       </w:r>
     </w:p>
     <w:p>
@@ -1866,6 +2052,73 @@
           </w:p>
         </w:tc>
       </w:tr>
+      <w:tr>
+        <w:trPr>
+          <w:cantSplit/>
+        </w:trPr>
+        <w:tc>
+          <w:tcPr>
+            <w:tcW w:type="dxa" w:w="2160"/>
+            <w:vAlign w:val="center"/>
+            <w:tcBorders>
+              <w:top w:val="single" w:sz="4" w:color="D9D9D9"/>
+              <w:left w:val="single" w:sz="4" w:color="D9D9D9"/>
+              <w:bottom w:val="single" w:sz="4" w:color="D9D9D9"/>
+              <w:right w:val="single" w:sz="4" w:color="D9D9D9"/>
+            </w:tcBorders>
+            <w:tcMar>
+              <w:top w:w="110" w:type="dxa"/>
+              <w:left w:w="110" w:type="dxa"/>
+              <w:bottom w:w="110" w:type="dxa"/>
+              <w:right w:w="110" w:type="dxa"/>
+            </w:tcMar>
+            <w:shd w:fill="FFFFFF"/>
+          </w:tcPr>
+          <w:p>
+            <w:pPr>
+              <w:spacing w:after="40"/>
+            </w:pPr>
+            <w:r>
+              <w:rPr>
+                <w:b w:val="0"/>
+                <w:sz w:val="21"/>
+              </w:rPr>
+              <w:t>25 ottobre 2026</w:t>
+            </w:r>
+          </w:p>
+        </w:tc>
+        <w:tc>
+          <w:tcPr>
+            <w:tcW w:type="dxa" w:w="7488"/>
+            <w:vAlign w:val="center"/>
+            <w:tcBorders>
+              <w:top w:val="single" w:sz="4" w:color="D9D9D9"/>
+              <w:left w:val="single" w:sz="4" w:color="D9D9D9"/>
+              <w:bottom w:val="single" w:sz="4" w:color="D9D9D9"/>
+              <w:right w:val="single" w:sz="4" w:color="D9D9D9"/>
+            </w:tcBorders>
+            <w:tcMar>
+              <w:top w:w="110" w:type="dxa"/>
+              <w:left w:w="110" w:type="dxa"/>
+              <w:bottom w:w="110" w:type="dxa"/>
+              <w:right w:w="110" w:type="dxa"/>
+            </w:tcMar>
+            <w:shd w:fill="FFFFFF"/>
+          </w:tcPr>
+          <w:p>
+            <w:pPr>
+              <w:spacing w:after="40"/>
+            </w:pPr>
+            <w:r>
+              <w:rPr>
+                <w:b w:val="0"/>
+                <w:sz w:val="21"/>
+              </w:rPr>
+              <w:t>Revisione 0.2: registrate e implementate nel backend/CLI le decisioni su lingua conversazionale, streaming testuale e progressi; verificate con provider simulato. Modello LLM reale non verificato.</w:t>
+            </w:r>
+          </w:p>
+        </w:tc>
+      </w:tr>
     </w:tbl>
     <w:p>
       <w:pPr>
@@ -1895,7 +2148,7 @@
       <w:rPr>
         <w:sz w:val="18"/>
       </w:rPr>
-      <w:t xml:space="preserve">Kairos  ·  0.1  ·  </w:t>
+      <w:t xml:space="preserve">Kairos  ·  0.2  ·  </w:t>
     </w:r>
     <w:fldSimple w:instr="PAGE"/>
   </w:p>

</xml_diff>